<commit_message>
feat: rewrite profile links, canonical metadata, and README with 5+ yrs Lead Engineer details
</commit_message>
<xml_diff>
--- a/public/Muhammad Sujon Cv.docx
+++ b/public/Muhammad Sujon Cv.docx
@@ -233,7 +233,7 @@
             <w:sz w:val="20"/>
             <w:szCs w:val="20"/>
           </w:rPr>
-          <w:t>https://www.linkedin.com/in/muhammadsujon</w:t>
+          <w:t>https://www.linkedin.com/in/developer-sujon</w:t>
         </w:r>
       </w:hyperlink>
     </w:p>
@@ -3452,7 +3452,7 @@
             <w:sz w:val="18"/>
             <w:szCs w:val="18"/>
           </w:rPr>
-          <w:t>https://www.linkedin.com/in/muhammadsujon</w:t>
+          <w:t>https://www.linkedin.com/in/developer-sujon</w:t>
         </w:r>
       </w:hyperlink>
     </w:p>
@@ -3730,7 +3730,7 @@
             <w:sz w:val="18"/>
             <w:szCs w:val="18"/>
           </w:rPr>
-          <w:t>https://www.facebook.com/muhammadsujon.me</w:t>
+          <w:t>https://www.facebook.com/sujon.developer</w:t>
         </w:r>
       </w:hyperlink>
     </w:p>

</xml_diff>